<commit_message>
intento1000 de agregar el doc
</commit_message>
<xml_diff>
--- a/Formato Solución Problemas Lógica (2).docx
+++ b/Formato Solución Problemas Lógica (2).docx
@@ -23,7 +23,23 @@
           <w:b/>
           <w:bCs/>
         </w:rPr>
-        <w:t xml:space="preserve">Problema: </w:t>
+        <w:t>5.</w:t>
+      </w:r>
+      <w:r>
+        <w:rPr>
+          <w:rFonts w:asciiTheme="majorHAnsi" w:hAnsiTheme="majorHAnsi" w:cstheme="majorHAnsi"/>
+          <w:b/>
+          <w:bCs/>
+        </w:rPr>
+        <w:t xml:space="preserve"> </w:t>
+      </w:r>
+      <w:r>
+        <w:rPr>
+          <w:rFonts w:asciiTheme="majorHAnsi" w:hAnsiTheme="majorHAnsi" w:cstheme="majorHAnsi"/>
+          <w:b/>
+          <w:bCs/>
+        </w:rPr>
+        <w:t>Detectar Teorema de Pitágoras un grupo de ternas.</w:t>
       </w:r>
     </w:p>
     <w:p>
@@ -105,31 +121,20 @@
           </w:p>
           <w:p>
             <w:pPr>
-              <w:rPr>
-                <w:rFonts w:asciiTheme="majorHAnsi" w:hAnsiTheme="majorHAnsi" w:cstheme="majorHAnsi"/>
-                <w:color w:val="FF0000"/>
-              </w:rPr>
-            </w:pPr>
-            <w:r>
-              <w:rPr>
-                <w:rFonts w:asciiTheme="majorHAnsi" w:hAnsiTheme="majorHAnsi" w:cstheme="majorHAnsi"/>
-                <w:color w:val="FF0000"/>
-              </w:rPr>
-              <w:t>Describa cuál es el objetivo de analizar el problema, describa con sus palabras y de forma concreta qu</w:t>
-            </w:r>
-            <w:r>
-              <w:rPr>
-                <w:rFonts w:asciiTheme="majorHAnsi" w:hAnsiTheme="majorHAnsi" w:cstheme="majorHAnsi"/>
-                <w:color w:val="FF0000"/>
-              </w:rPr>
-              <w:t>é</w:t>
-            </w:r>
-            <w:r>
-              <w:rPr>
-                <w:rFonts w:asciiTheme="majorHAnsi" w:hAnsiTheme="majorHAnsi" w:cstheme="majorHAnsi"/>
-                <w:color w:val="FF0000"/>
-              </w:rPr>
-              <w:t xml:space="preserve"> es lo que se quiere.</w:t>
+              <w:pStyle w:val="Prrafodelista"/>
+              <w:numPr>
+                <w:ilvl w:val="0"/>
+                <w:numId w:val="1"/>
+              </w:numPr>
+              <w:rPr>
+                <w:rFonts w:asciiTheme="majorHAnsi" w:hAnsiTheme="majorHAnsi" w:cstheme="majorHAnsi"/>
+              </w:rPr>
+            </w:pPr>
+            <w:r>
+              <w:rPr>
+                <w:rFonts w:asciiTheme="majorHAnsi" w:hAnsiTheme="majorHAnsi" w:cstheme="majorHAnsi"/>
+              </w:rPr>
+              <w:t>Con el uso de un algoritmo, se deba detectar, de un grupo de números, cuantos tríos de valores, representan un triángulo rectángulo, utilizando como referencia, el teorema de Pitágoras.</w:t>
             </w:r>
           </w:p>
           <w:p>
@@ -189,17 +194,56 @@
           </w:p>
           <w:p>
             <w:pPr>
-              <w:rPr>
-                <w:rFonts w:asciiTheme="majorHAnsi" w:hAnsiTheme="majorHAnsi" w:cstheme="majorHAnsi"/>
-                <w:color w:val="FF0000"/>
-              </w:rPr>
-            </w:pPr>
-            <w:r>
-              <w:rPr>
-                <w:rFonts w:asciiTheme="majorHAnsi" w:hAnsiTheme="majorHAnsi" w:cstheme="majorHAnsi"/>
-                <w:color w:val="FF0000"/>
-              </w:rPr>
-              <w:t>Menciones personas, animales o cosas que hagan parte del problema.</w:t>
+              <w:pStyle w:val="Prrafodelista"/>
+              <w:numPr>
+                <w:ilvl w:val="0"/>
+                <w:numId w:val="1"/>
+              </w:numPr>
+              <w:rPr>
+                <w:rFonts w:asciiTheme="majorHAnsi" w:hAnsiTheme="majorHAnsi" w:cstheme="majorHAnsi"/>
+              </w:rPr>
+            </w:pPr>
+            <w:r>
+              <w:rPr>
+                <w:rFonts w:asciiTheme="majorHAnsi" w:hAnsiTheme="majorHAnsi" w:cstheme="majorHAnsi"/>
+              </w:rPr>
+              <w:t>El grupo de números</w:t>
+            </w:r>
+          </w:p>
+          <w:p>
+            <w:pPr>
+              <w:pStyle w:val="Prrafodelista"/>
+              <w:numPr>
+                <w:ilvl w:val="0"/>
+                <w:numId w:val="1"/>
+              </w:numPr>
+              <w:rPr>
+                <w:rFonts w:asciiTheme="majorHAnsi" w:hAnsiTheme="majorHAnsi" w:cstheme="majorHAnsi"/>
+              </w:rPr>
+            </w:pPr>
+            <w:r>
+              <w:rPr>
+                <w:rFonts w:asciiTheme="majorHAnsi" w:hAnsiTheme="majorHAnsi" w:cstheme="majorHAnsi"/>
+              </w:rPr>
+              <w:t>Las ternas (El trío de números)</w:t>
+            </w:r>
+          </w:p>
+          <w:p>
+            <w:pPr>
+              <w:pStyle w:val="Prrafodelista"/>
+              <w:numPr>
+                <w:ilvl w:val="0"/>
+                <w:numId w:val="1"/>
+              </w:numPr>
+              <w:rPr>
+                <w:rFonts w:asciiTheme="majorHAnsi" w:hAnsiTheme="majorHAnsi" w:cstheme="majorHAnsi"/>
+              </w:rPr>
+            </w:pPr>
+            <w:r>
+              <w:rPr>
+                <w:rFonts w:asciiTheme="majorHAnsi" w:hAnsiTheme="majorHAnsi" w:cstheme="majorHAnsi"/>
+              </w:rPr>
+              <w:t>EL teorema de Pitágoras.</w:t>
             </w:r>
           </w:p>
           <w:p>
@@ -258,17 +302,118 @@
           </w:p>
           <w:p>
             <w:pPr>
-              <w:rPr>
-                <w:rFonts w:asciiTheme="majorHAnsi" w:hAnsiTheme="majorHAnsi" w:cstheme="majorHAnsi"/>
-                <w:color w:val="FF0000"/>
-              </w:rPr>
-            </w:pPr>
-            <w:r>
-              <w:rPr>
-                <w:rFonts w:asciiTheme="majorHAnsi" w:hAnsiTheme="majorHAnsi" w:cstheme="majorHAnsi"/>
-                <w:color w:val="FF0000"/>
-              </w:rPr>
-              <w:t>Describa la información concreta que tiene para poder solucionar el problema, números, datos textuales etc.</w:t>
+              <w:pStyle w:val="Prrafodelista"/>
+              <w:numPr>
+                <w:ilvl w:val="0"/>
+                <w:numId w:val="2"/>
+              </w:numPr>
+              <w:rPr>
+                <w:rFonts w:asciiTheme="majorHAnsi" w:hAnsiTheme="majorHAnsi" w:cstheme="majorHAnsi"/>
+              </w:rPr>
+            </w:pPr>
+            <w:r>
+              <w:rPr>
+                <w:rFonts w:asciiTheme="majorHAnsi" w:hAnsiTheme="majorHAnsi" w:cstheme="majorHAnsi"/>
+              </w:rPr>
+              <w:t xml:space="preserve">El problema nos da como punto de referencia el teorema de Pitágoras, siendo </w:t>
+            </w:r>
+            <m:oMath>
+              <m:sSup>
+                <m:sSupPr>
+                  <m:ctrlPr>
+                    <w:rPr>
+                      <w:rFonts w:ascii="Cambria Math" w:hAnsi="Cambria Math" w:cstheme="majorHAnsi"/>
+                      <w:i/>
+                    </w:rPr>
+                  </m:ctrlPr>
+                </m:sSupPr>
+                <m:e>
+                  <m:r>
+                    <w:rPr>
+                      <w:rFonts w:ascii="Cambria Math" w:hAnsi="Cambria Math" w:cstheme="majorHAnsi"/>
+                    </w:rPr>
+                    <m:t>a</m:t>
+                  </m:r>
+                </m:e>
+                <m:sup>
+                  <m:r>
+                    <w:rPr>
+                      <w:rFonts w:ascii="Cambria Math" w:hAnsi="Cambria Math" w:cstheme="majorHAnsi"/>
+                    </w:rPr>
+                    <m:t>2</m:t>
+                  </m:r>
+                </m:sup>
+              </m:sSup>
+              <m:r>
+                <w:rPr>
+                  <w:rFonts w:ascii="Cambria Math" w:hAnsi="Cambria Math" w:cstheme="majorHAnsi"/>
+                </w:rPr>
+                <m:t xml:space="preserve">+ </m:t>
+              </m:r>
+              <m:sSup>
+                <m:sSupPr>
+                  <m:ctrlPr>
+                    <w:rPr>
+                      <w:rFonts w:ascii="Cambria Math" w:hAnsi="Cambria Math" w:cstheme="majorHAnsi"/>
+                      <w:i/>
+                    </w:rPr>
+                  </m:ctrlPr>
+                </m:sSupPr>
+                <m:e>
+                  <m:r>
+                    <w:rPr>
+                      <w:rFonts w:ascii="Cambria Math" w:hAnsi="Cambria Math" w:cstheme="majorHAnsi"/>
+                    </w:rPr>
+                    <m:t>b</m:t>
+                  </m:r>
+                </m:e>
+                <m:sup>
+                  <m:r>
+                    <w:rPr>
+                      <w:rFonts w:ascii="Cambria Math" w:hAnsi="Cambria Math" w:cstheme="majorHAnsi"/>
+                    </w:rPr>
+                    <m:t>2</m:t>
+                  </m:r>
+                </m:sup>
+              </m:sSup>
+              <m:r>
+                <w:rPr>
+                  <w:rFonts w:ascii="Cambria Math" w:hAnsi="Cambria Math" w:cstheme="majorHAnsi"/>
+                </w:rPr>
+                <m:t>=</m:t>
+              </m:r>
+              <m:sSup>
+                <m:sSupPr>
+                  <m:ctrlPr>
+                    <w:rPr>
+                      <w:rFonts w:ascii="Cambria Math" w:hAnsi="Cambria Math" w:cstheme="majorHAnsi"/>
+                      <w:i/>
+                    </w:rPr>
+                  </m:ctrlPr>
+                </m:sSupPr>
+                <m:e>
+                  <m:r>
+                    <w:rPr>
+                      <w:rFonts w:ascii="Cambria Math" w:hAnsi="Cambria Math" w:cstheme="majorHAnsi"/>
+                    </w:rPr>
+                    <m:t>c</m:t>
+                  </m:r>
+                </m:e>
+                <m:sup>
+                  <m:r>
+                    <w:rPr>
+                      <w:rFonts w:ascii="Cambria Math" w:hAnsi="Cambria Math" w:cstheme="majorHAnsi"/>
+                    </w:rPr>
+                    <m:t>2</m:t>
+                  </m:r>
+                </m:sup>
+              </m:sSup>
+            </m:oMath>
+            <w:r>
+              <w:rPr>
+                <w:rFonts w:asciiTheme="majorHAnsi" w:hAnsiTheme="majorHAnsi" w:cstheme="majorHAnsi"/>
+              </w:rPr>
+              <w:t xml:space="preserve">, para poder validar las ternas que representen un triangulo rectángulo. </w:t>
             </w:r>
           </w:p>
           <w:p>
@@ -359,18 +504,199 @@
           </w:p>
           <w:p>
             <w:pPr>
-              <w:rPr>
-                <w:rFonts w:asciiTheme="majorHAnsi" w:hAnsiTheme="majorHAnsi" w:cstheme="majorHAnsi"/>
-                <w:color w:val="FF0000"/>
-              </w:rPr>
-            </w:pPr>
-            <w:r>
-              <w:rPr>
-                <w:rFonts w:asciiTheme="majorHAnsi" w:hAnsiTheme="majorHAnsi" w:cstheme="majorHAnsi"/>
-                <w:color w:val="FF0000"/>
-              </w:rPr>
-              <w:t>Describa las restricciones teniendo en cuneta que una restricción es una norma o regla que no dejaría solucionar el problema, o que no permite la solución del mismo.</w:t>
-            </w:r>
+              <w:pStyle w:val="Prrafodelista"/>
+              <w:numPr>
+                <w:ilvl w:val="0"/>
+                <w:numId w:val="2"/>
+              </w:numPr>
+              <w:rPr>
+                <w:rFonts w:asciiTheme="majorHAnsi" w:hAnsiTheme="majorHAnsi" w:cstheme="majorHAnsi"/>
+              </w:rPr>
+            </w:pPr>
+            <w:r>
+              <w:rPr>
+                <w:rFonts w:asciiTheme="majorHAnsi" w:hAnsiTheme="majorHAnsi" w:cstheme="majorHAnsi"/>
+              </w:rPr>
+              <w:t xml:space="preserve">Las ternas deben cumplir el teorema </w:t>
+            </w:r>
+            <m:oMath>
+              <m:sSup>
+                <m:sSupPr>
+                  <m:ctrlPr>
+                    <w:rPr>
+                      <w:rFonts w:ascii="Cambria Math" w:hAnsi="Cambria Math" w:cstheme="majorHAnsi"/>
+                      <w:i/>
+                    </w:rPr>
+                  </m:ctrlPr>
+                </m:sSupPr>
+                <m:e>
+                  <m:r>
+                    <w:rPr>
+                      <w:rFonts w:ascii="Cambria Math" w:hAnsi="Cambria Math" w:cstheme="majorHAnsi"/>
+                    </w:rPr>
+                    <m:t>a</m:t>
+                  </m:r>
+                </m:e>
+                <m:sup>
+                  <m:r>
+                    <w:rPr>
+                      <w:rFonts w:ascii="Cambria Math" w:hAnsi="Cambria Math" w:cstheme="majorHAnsi"/>
+                    </w:rPr>
+                    <m:t>2</m:t>
+                  </m:r>
+                </m:sup>
+              </m:sSup>
+              <m:r>
+                <w:rPr>
+                  <w:rFonts w:ascii="Cambria Math" w:hAnsi="Cambria Math" w:cstheme="majorHAnsi"/>
+                </w:rPr>
+                <m:t xml:space="preserve">+ </m:t>
+              </m:r>
+              <m:sSup>
+                <m:sSupPr>
+                  <m:ctrlPr>
+                    <w:rPr>
+                      <w:rFonts w:ascii="Cambria Math" w:hAnsi="Cambria Math" w:cstheme="majorHAnsi"/>
+                      <w:i/>
+                    </w:rPr>
+                  </m:ctrlPr>
+                </m:sSupPr>
+                <m:e>
+                  <m:r>
+                    <w:rPr>
+                      <w:rFonts w:ascii="Cambria Math" w:hAnsi="Cambria Math" w:cstheme="majorHAnsi"/>
+                    </w:rPr>
+                    <m:t>b</m:t>
+                  </m:r>
+                </m:e>
+                <m:sup>
+                  <m:r>
+                    <w:rPr>
+                      <w:rFonts w:ascii="Cambria Math" w:hAnsi="Cambria Math" w:cstheme="majorHAnsi"/>
+                    </w:rPr>
+                    <m:t>2</m:t>
+                  </m:r>
+                </m:sup>
+              </m:sSup>
+              <m:r>
+                <w:rPr>
+                  <w:rFonts w:ascii="Cambria Math" w:hAnsi="Cambria Math" w:cstheme="majorHAnsi"/>
+                </w:rPr>
+                <m:t>=</m:t>
+              </m:r>
+              <m:sSup>
+                <m:sSupPr>
+                  <m:ctrlPr>
+                    <w:rPr>
+                      <w:rFonts w:ascii="Cambria Math" w:hAnsi="Cambria Math" w:cstheme="majorHAnsi"/>
+                      <w:i/>
+                    </w:rPr>
+                  </m:ctrlPr>
+                </m:sSupPr>
+                <m:e>
+                  <m:r>
+                    <w:rPr>
+                      <w:rFonts w:ascii="Cambria Math" w:hAnsi="Cambria Math" w:cstheme="majorHAnsi"/>
+                    </w:rPr>
+                    <m:t>c</m:t>
+                  </m:r>
+                </m:e>
+                <m:sup>
+                  <m:r>
+                    <w:rPr>
+                      <w:rFonts w:ascii="Cambria Math" w:hAnsi="Cambria Math" w:cstheme="majorHAnsi"/>
+                    </w:rPr>
+                    <m:t>2</m:t>
+                  </m:r>
+                </m:sup>
+              </m:sSup>
+            </m:oMath>
+            <w:r>
+              <w:rPr>
+                <w:rFonts w:asciiTheme="majorHAnsi" w:hAnsiTheme="majorHAnsi" w:cstheme="majorHAnsi"/>
+              </w:rPr>
+              <w:t>.</w:t>
+            </w:r>
+          </w:p>
+          <w:p>
+            <w:pPr>
+              <w:pStyle w:val="Prrafodelista"/>
+              <w:numPr>
+                <w:ilvl w:val="0"/>
+                <w:numId w:val="2"/>
+              </w:numPr>
+              <w:rPr>
+                <w:rFonts w:asciiTheme="majorHAnsi" w:hAnsiTheme="majorHAnsi" w:cstheme="majorHAnsi"/>
+              </w:rPr>
+            </w:pPr>
+            <w:r>
+              <w:rPr>
+                <w:rFonts w:asciiTheme="majorHAnsi" w:hAnsiTheme="majorHAnsi" w:cstheme="majorHAnsi"/>
+              </w:rPr>
+              <w:t>El algoritmo, debe identificar de la terna, el número mayor, y asignarlo a c.</w:t>
+            </w:r>
+          </w:p>
+          <w:p>
+            <w:pPr>
+              <w:pStyle w:val="Prrafodelista"/>
+              <w:numPr>
+                <w:ilvl w:val="0"/>
+                <w:numId w:val="2"/>
+              </w:numPr>
+              <w:rPr>
+                <w:rFonts w:asciiTheme="majorHAnsi" w:hAnsiTheme="majorHAnsi" w:cstheme="majorHAnsi"/>
+              </w:rPr>
+            </w:pPr>
+            <w:r>
+              <w:rPr>
+                <w:rFonts w:asciiTheme="majorHAnsi" w:hAnsiTheme="majorHAnsi" w:cstheme="majorHAnsi"/>
+              </w:rPr>
+              <w:t xml:space="preserve">No se sabe cuántos números hay en el grupo, o las ternas que representen el triángulo rectángulo. </w:t>
+            </w:r>
+          </w:p>
+          <w:p>
+            <w:pPr>
+              <w:pStyle w:val="Prrafodelista"/>
+              <w:numPr>
+                <w:ilvl w:val="0"/>
+                <w:numId w:val="2"/>
+              </w:numPr>
+              <w:rPr>
+                <w:rFonts w:asciiTheme="majorHAnsi" w:hAnsiTheme="majorHAnsi" w:cstheme="majorHAnsi"/>
+              </w:rPr>
+            </w:pPr>
+            <w:r>
+              <w:rPr>
+                <w:rFonts w:asciiTheme="majorHAnsi" w:hAnsiTheme="majorHAnsi" w:cstheme="majorHAnsi"/>
+              </w:rPr>
+              <w:t xml:space="preserve">Se deben comparar 3 </w:t>
+            </w:r>
+            <w:r>
+              <w:rPr>
+                <w:rFonts w:asciiTheme="majorHAnsi" w:hAnsiTheme="majorHAnsi" w:cstheme="majorHAnsi"/>
+              </w:rPr>
+              <w:t>números</w:t>
+            </w:r>
+            <w:r>
+              <w:rPr>
+                <w:rFonts w:asciiTheme="majorHAnsi" w:hAnsiTheme="majorHAnsi" w:cstheme="majorHAnsi"/>
+              </w:rPr>
+              <w:t xml:space="preserve"> del grupo, y evitar que se repitan</w:t>
+            </w:r>
+            <w:r>
+              <w:rPr>
+                <w:rFonts w:asciiTheme="majorHAnsi" w:hAnsiTheme="majorHAnsi" w:cstheme="majorHAnsi"/>
+              </w:rPr>
+              <w:t xml:space="preserve"> los mismos 3.</w:t>
+            </w:r>
+          </w:p>
+          <w:p>
+            <w:pPr>
+              <w:pStyle w:val="Prrafodelista"/>
+              <w:rPr>
+                <w:rFonts w:asciiTheme="majorHAnsi" w:hAnsiTheme="majorHAnsi" w:cstheme="majorHAnsi"/>
+              </w:rPr>
+            </w:pPr>
           </w:p>
           <w:p>
             <w:pPr>
@@ -428,21 +754,141 @@
           </w:p>
           <w:p>
             <w:pPr>
-              <w:rPr>
-                <w:rFonts w:asciiTheme="majorHAnsi" w:hAnsiTheme="majorHAnsi" w:cstheme="majorHAnsi"/>
-                <w:color w:val="FF0000"/>
-              </w:rPr>
-            </w:pPr>
-            <w:r>
-              <w:rPr>
-                <w:rFonts w:asciiTheme="majorHAnsi" w:hAnsiTheme="majorHAnsi" w:cstheme="majorHAnsi"/>
-                <w:color w:val="FF0000"/>
-              </w:rPr>
-              <w:t xml:space="preserve">Describa las condiciones del problema teniendo en cuenta que una condición es una regla o norma que permite bifurcar y/o tomar decisiones en diferentes momentos datos. </w:t>
-            </w:r>
-          </w:p>
-          <w:p>
-            <w:pPr>
+              <w:pStyle w:val="Prrafodelista"/>
+              <w:numPr>
+                <w:ilvl w:val="0"/>
+                <w:numId w:val="2"/>
+              </w:numPr>
+              <w:rPr>
+                <w:rFonts w:asciiTheme="majorHAnsi" w:hAnsiTheme="majorHAnsi" w:cstheme="majorHAnsi"/>
+              </w:rPr>
+            </w:pPr>
+            <w:r>
+              <w:rPr>
+                <w:rFonts w:asciiTheme="majorHAnsi" w:hAnsiTheme="majorHAnsi" w:cstheme="majorHAnsi"/>
+              </w:rPr>
+              <w:t xml:space="preserve">Cumplir el teorema de Pitágoras </w:t>
+            </w:r>
+            <m:oMath>
+              <m:sSup>
+                <m:sSupPr>
+                  <m:ctrlPr>
+                    <w:rPr>
+                      <w:rFonts w:ascii="Cambria Math" w:hAnsi="Cambria Math" w:cstheme="majorHAnsi"/>
+                      <w:i/>
+                    </w:rPr>
+                  </m:ctrlPr>
+                </m:sSupPr>
+                <m:e>
+                  <m:r>
+                    <w:rPr>
+                      <w:rFonts w:ascii="Cambria Math" w:hAnsi="Cambria Math" w:cstheme="majorHAnsi"/>
+                    </w:rPr>
+                    <m:t>a</m:t>
+                  </m:r>
+                </m:e>
+                <m:sup>
+                  <m:r>
+                    <w:rPr>
+                      <w:rFonts w:ascii="Cambria Math" w:hAnsi="Cambria Math" w:cstheme="majorHAnsi"/>
+                    </w:rPr>
+                    <m:t>2</m:t>
+                  </m:r>
+                </m:sup>
+              </m:sSup>
+              <m:r>
+                <w:rPr>
+                  <w:rFonts w:ascii="Cambria Math" w:hAnsi="Cambria Math" w:cstheme="majorHAnsi"/>
+                </w:rPr>
+                <m:t xml:space="preserve">+ </m:t>
+              </m:r>
+              <m:sSup>
+                <m:sSupPr>
+                  <m:ctrlPr>
+                    <w:rPr>
+                      <w:rFonts w:ascii="Cambria Math" w:hAnsi="Cambria Math" w:cstheme="majorHAnsi"/>
+                      <w:i/>
+                    </w:rPr>
+                  </m:ctrlPr>
+                </m:sSupPr>
+                <m:e>
+                  <m:r>
+                    <w:rPr>
+                      <w:rFonts w:ascii="Cambria Math" w:hAnsi="Cambria Math" w:cstheme="majorHAnsi"/>
+                    </w:rPr>
+                    <m:t>b</m:t>
+                  </m:r>
+                </m:e>
+                <m:sup>
+                  <m:r>
+                    <w:rPr>
+                      <w:rFonts w:ascii="Cambria Math" w:hAnsi="Cambria Math" w:cstheme="majorHAnsi"/>
+                    </w:rPr>
+                    <m:t>2</m:t>
+                  </m:r>
+                </m:sup>
+              </m:sSup>
+              <m:r>
+                <w:rPr>
+                  <w:rFonts w:ascii="Cambria Math" w:hAnsi="Cambria Math" w:cstheme="majorHAnsi"/>
+                </w:rPr>
+                <m:t>=</m:t>
+              </m:r>
+              <m:sSup>
+                <m:sSupPr>
+                  <m:ctrlPr>
+                    <w:rPr>
+                      <w:rFonts w:ascii="Cambria Math" w:hAnsi="Cambria Math" w:cstheme="majorHAnsi"/>
+                      <w:i/>
+                    </w:rPr>
+                  </m:ctrlPr>
+                </m:sSupPr>
+                <m:e>
+                  <m:r>
+                    <w:rPr>
+                      <w:rFonts w:ascii="Cambria Math" w:hAnsi="Cambria Math" w:cstheme="majorHAnsi"/>
+                    </w:rPr>
+                    <m:t>c</m:t>
+                  </m:r>
+                </m:e>
+                <m:sup>
+                  <m:r>
+                    <w:rPr>
+                      <w:rFonts w:ascii="Cambria Math" w:hAnsi="Cambria Math" w:cstheme="majorHAnsi"/>
+                    </w:rPr>
+                    <m:t>2</m:t>
+                  </m:r>
+                </m:sup>
+              </m:sSup>
+            </m:oMath>
+            <w:r>
+              <w:rPr>
+                <w:rFonts w:asciiTheme="majorHAnsi" w:hAnsiTheme="majorHAnsi" w:cstheme="majorHAnsi"/>
+              </w:rPr>
+              <w:t>.</w:t>
+            </w:r>
+          </w:p>
+          <w:p>
+            <w:pPr>
+              <w:pStyle w:val="Prrafodelista"/>
+              <w:numPr>
+                <w:ilvl w:val="0"/>
+                <w:numId w:val="6"/>
+              </w:numPr>
+              <w:rPr>
+                <w:rFonts w:asciiTheme="majorHAnsi" w:hAnsiTheme="majorHAnsi" w:cstheme="majorHAnsi"/>
+              </w:rPr>
+            </w:pPr>
+            <w:r>
+              <w:rPr>
+                <w:rFonts w:asciiTheme="majorHAnsi" w:hAnsiTheme="majorHAnsi" w:cstheme="majorHAnsi"/>
+              </w:rPr>
+              <w:t>Se debe analizar cuantas combinaciones representan un triángulo rectángulo.</w:t>
+            </w:r>
+          </w:p>
+          <w:p>
+            <w:pPr>
+              <w:ind w:left="360"/>
               <w:rPr>
                 <w:rFonts w:asciiTheme="majorHAnsi" w:hAnsiTheme="majorHAnsi" w:cstheme="majorHAnsi"/>
               </w:rPr>
@@ -461,6 +907,7 @@
                 <w:rFonts w:asciiTheme="majorHAnsi" w:hAnsiTheme="majorHAnsi" w:cstheme="majorHAnsi"/>
                 <w:b/>
                 <w:bCs/>
+                <w:u w:val="single"/>
               </w:rPr>
             </w:pPr>
             <w:r>
@@ -489,24 +936,13 @@
           </w:p>
           <w:p>
             <w:pPr>
-              <w:rPr>
-                <w:rFonts w:asciiTheme="majorHAnsi" w:hAnsiTheme="majorHAnsi" w:cstheme="majorHAnsi"/>
-                <w:color w:val="FF0000"/>
-              </w:rPr>
-            </w:pPr>
-            <w:r>
-              <w:rPr>
-                <w:rFonts w:asciiTheme="majorHAnsi" w:hAnsiTheme="majorHAnsi" w:cstheme="majorHAnsi"/>
-                <w:color w:val="FF0000"/>
-              </w:rPr>
-              <w:t>Describa la solución a partir de enumerar los pasos en secuencia lógica.</w:t>
-            </w:r>
-          </w:p>
-          <w:p>
-            <w:pPr>
-              <w:rPr>
-                <w:rFonts w:asciiTheme="majorHAnsi" w:hAnsiTheme="majorHAnsi" w:cstheme="majorHAnsi"/>
-                <w:color w:val="FF0000"/>
+              <w:pStyle w:val="Prrafodelista"/>
+              <w:numPr>
+                <w:ilvl w:val="0"/>
+                <w:numId w:val="6"/>
+              </w:numPr>
+              <w:rPr>
+                <w:rFonts w:asciiTheme="majorHAnsi" w:hAnsiTheme="majorHAnsi" w:cstheme="majorHAnsi"/>
               </w:rPr>
             </w:pPr>
           </w:p>
@@ -596,6 +1032,656 @@
     </w:sectPr>
   </w:body>
 </w:document>
+</file>
+
+<file path=word/numbering.xml><?xml version="1.0" encoding="utf-8"?>
+<w:numbering xmlns:wpc="http://schemas.microsoft.com/office/word/2010/wordprocessingCanvas" xmlns:cx="http://schemas.microsoft.com/office/drawing/2014/chartex" xmlns:cx1="http://schemas.microsoft.com/office/drawing/2015/9/8/chartex" xmlns:cx2="http://schemas.microsoft.com/office/drawing/2015/10/21/chartex" xmlns:cx3="http://schemas.microsoft.com/office/drawing/2016/5/9/chartex" xmlns:cx4="http://schemas.microsoft.com/office/drawing/2016/5/10/chartex" xmlns:cx5="http://schemas.microsoft.com/office/drawing/2016/5/11/chartex" xmlns:cx6="http://schemas.microsoft.com/office/drawing/2016/5/12/chartex" xmlns:cx7="http://schemas.microsoft.com/office/drawing/2016/5/13/chartex" xmlns:cx8="http://schemas.microsoft.com/office/drawing/2016/5/14/chartex" xmlns:mc="http://schemas.openxmlformats.org/markup-compatibility/2006" xmlns:aink="http://schemas.microsoft.com/office/drawing/2016/ink" xmlns:am3d="http://schemas.microsoft.com/office/drawing/2017/model3d" xmlns:o="urn:schemas-microsoft-com:office:office" xmlns:oel="http://schemas.microsoft.com/office/2019/extlst" xmlns:r="http://schemas.openxmlformats.org/officeDocument/2006/relationships" xmlns:m="http://schemas.openxmlformats.org/officeDocument/2006/math" xmlns:v="urn:schemas-microsoft-com:vml" xmlns:wp14="http://schemas.microsoft.com/office/word/2010/wordprocessingDrawing" xmlns:wp="http://schemas.openxmlformats.org/drawingml/2006/wordprocessingDrawing" xmlns:w10="urn:schemas-microsoft-com:office:word" xmlns:w="http://schemas.openxmlformats.org/wordprocessingml/2006/main" xmlns:w14="http://schemas.microsoft.com/office/word/2010/wordml" xmlns:w15="http://schemas.microsoft.com/office/word/2012/wordml" xmlns:w16cex="http://schemas.microsoft.com/office/word/2018/wordml/cex" xmlns:w16cid="http://schemas.microsoft.com/office/word/2016/wordml/cid" xmlns:w16="http://schemas.microsoft.com/office/word/2018/wordml" xmlns:w16du="http://schemas.microsoft.com/office/word/2023/wordml/word16du" xmlns:w16sdtdh="http://schemas.microsoft.com/office/word/2020/wordml/sdtdatahash" xmlns:w16sdtfl="http://schemas.microsoft.com/office/word/2024/wordml/sdtformatlock" xmlns:w16se="http://schemas.microsoft.com/office/word/2015/wordml/symex" xmlns:wpg="http://schemas.microsoft.com/office/word/2010/wordprocessingGroup" xmlns:wpi="http://schemas.microsoft.com/office/word/2010/wordprocessingInk" xmlns:wne="http://schemas.microsoft.com/office/word/2006/wordml" xmlns:wps="http://schemas.microsoft.com/office/word/2010/wordprocessingShape" mc:Ignorable="w14 w15 w16se w16cid w16 w16cex w16sdtdh w16sdtfl w16du wp14">
+  <w:abstractNum w:abstractNumId="0" w15:restartNumberingAfterBreak="0">
+    <w:nsid w:val="121E3809"/>
+    <w:multiLevelType w:val="hybridMultilevel"/>
+    <w:tmpl w:val="E292B7E8"/>
+    <w:lvl w:ilvl="0" w:tplc="240A0001">
+      <w:start w:val="1"/>
+      <w:numFmt w:val="bullet"/>
+      <w:lvlText w:val=""/>
+      <w:lvlJc w:val="left"/>
+      <w:pPr>
+        <w:ind w:left="720" w:hanging="360"/>
+      </w:pPr>
+      <w:rPr>
+        <w:rFonts w:ascii="Symbol" w:hAnsi="Symbol" w:hint="default"/>
+      </w:rPr>
+    </w:lvl>
+    <w:lvl w:ilvl="1" w:tplc="240A0003" w:tentative="1">
+      <w:start w:val="1"/>
+      <w:numFmt w:val="bullet"/>
+      <w:lvlText w:val="o"/>
+      <w:lvlJc w:val="left"/>
+      <w:pPr>
+        <w:ind w:left="1440" w:hanging="360"/>
+      </w:pPr>
+      <w:rPr>
+        <w:rFonts w:ascii="Courier New" w:hAnsi="Courier New" w:cs="Courier New" w:hint="default"/>
+      </w:rPr>
+    </w:lvl>
+    <w:lvl w:ilvl="2" w:tplc="240A0005" w:tentative="1">
+      <w:start w:val="1"/>
+      <w:numFmt w:val="bullet"/>
+      <w:lvlText w:val=""/>
+      <w:lvlJc w:val="left"/>
+      <w:pPr>
+        <w:ind w:left="2160" w:hanging="360"/>
+      </w:pPr>
+      <w:rPr>
+        <w:rFonts w:ascii="Wingdings" w:hAnsi="Wingdings" w:hint="default"/>
+      </w:rPr>
+    </w:lvl>
+    <w:lvl w:ilvl="3" w:tplc="240A0001" w:tentative="1">
+      <w:start w:val="1"/>
+      <w:numFmt w:val="bullet"/>
+      <w:lvlText w:val=""/>
+      <w:lvlJc w:val="left"/>
+      <w:pPr>
+        <w:ind w:left="2880" w:hanging="360"/>
+      </w:pPr>
+      <w:rPr>
+        <w:rFonts w:ascii="Symbol" w:hAnsi="Symbol" w:hint="default"/>
+      </w:rPr>
+    </w:lvl>
+    <w:lvl w:ilvl="4" w:tplc="240A0003" w:tentative="1">
+      <w:start w:val="1"/>
+      <w:numFmt w:val="bullet"/>
+      <w:lvlText w:val="o"/>
+      <w:lvlJc w:val="left"/>
+      <w:pPr>
+        <w:ind w:left="3600" w:hanging="360"/>
+      </w:pPr>
+      <w:rPr>
+        <w:rFonts w:ascii="Courier New" w:hAnsi="Courier New" w:cs="Courier New" w:hint="default"/>
+      </w:rPr>
+    </w:lvl>
+    <w:lvl w:ilvl="5" w:tplc="240A0005" w:tentative="1">
+      <w:start w:val="1"/>
+      <w:numFmt w:val="bullet"/>
+      <w:lvlText w:val=""/>
+      <w:lvlJc w:val="left"/>
+      <w:pPr>
+        <w:ind w:left="4320" w:hanging="360"/>
+      </w:pPr>
+      <w:rPr>
+        <w:rFonts w:ascii="Wingdings" w:hAnsi="Wingdings" w:hint="default"/>
+      </w:rPr>
+    </w:lvl>
+    <w:lvl w:ilvl="6" w:tplc="240A0001" w:tentative="1">
+      <w:start w:val="1"/>
+      <w:numFmt w:val="bullet"/>
+      <w:lvlText w:val=""/>
+      <w:lvlJc w:val="left"/>
+      <w:pPr>
+        <w:ind w:left="5040" w:hanging="360"/>
+      </w:pPr>
+      <w:rPr>
+        <w:rFonts w:ascii="Symbol" w:hAnsi="Symbol" w:hint="default"/>
+      </w:rPr>
+    </w:lvl>
+    <w:lvl w:ilvl="7" w:tplc="240A0003" w:tentative="1">
+      <w:start w:val="1"/>
+      <w:numFmt w:val="bullet"/>
+      <w:lvlText w:val="o"/>
+      <w:lvlJc w:val="left"/>
+      <w:pPr>
+        <w:ind w:left="5760" w:hanging="360"/>
+      </w:pPr>
+      <w:rPr>
+        <w:rFonts w:ascii="Courier New" w:hAnsi="Courier New" w:cs="Courier New" w:hint="default"/>
+      </w:rPr>
+    </w:lvl>
+    <w:lvl w:ilvl="8" w:tplc="240A0005" w:tentative="1">
+      <w:start w:val="1"/>
+      <w:numFmt w:val="bullet"/>
+      <w:lvlText w:val=""/>
+      <w:lvlJc w:val="left"/>
+      <w:pPr>
+        <w:ind w:left="6480" w:hanging="360"/>
+      </w:pPr>
+      <w:rPr>
+        <w:rFonts w:ascii="Wingdings" w:hAnsi="Wingdings" w:hint="default"/>
+      </w:rPr>
+    </w:lvl>
+  </w:abstractNum>
+  <w:abstractNum w:abstractNumId="1" w15:restartNumberingAfterBreak="0">
+    <w:nsid w:val="12CB17DB"/>
+    <w:multiLevelType w:val="hybridMultilevel"/>
+    <w:tmpl w:val="C88AE594"/>
+    <w:lvl w:ilvl="0" w:tplc="240A000F">
+      <w:start w:val="1"/>
+      <w:numFmt w:val="decimal"/>
+      <w:lvlText w:val="%1."/>
+      <w:lvlJc w:val="left"/>
+      <w:pPr>
+        <w:ind w:left="720" w:hanging="360"/>
+      </w:pPr>
+    </w:lvl>
+    <w:lvl w:ilvl="1" w:tplc="240A0019" w:tentative="1">
+      <w:start w:val="1"/>
+      <w:numFmt w:val="lowerLetter"/>
+      <w:lvlText w:val="%2."/>
+      <w:lvlJc w:val="left"/>
+      <w:pPr>
+        <w:ind w:left="1440" w:hanging="360"/>
+      </w:pPr>
+    </w:lvl>
+    <w:lvl w:ilvl="2" w:tplc="240A001B" w:tentative="1">
+      <w:start w:val="1"/>
+      <w:numFmt w:val="lowerRoman"/>
+      <w:lvlText w:val="%3."/>
+      <w:lvlJc w:val="right"/>
+      <w:pPr>
+        <w:ind w:left="2160" w:hanging="180"/>
+      </w:pPr>
+    </w:lvl>
+    <w:lvl w:ilvl="3" w:tplc="240A000F" w:tentative="1">
+      <w:start w:val="1"/>
+      <w:numFmt w:val="decimal"/>
+      <w:lvlText w:val="%4."/>
+      <w:lvlJc w:val="left"/>
+      <w:pPr>
+        <w:ind w:left="2880" w:hanging="360"/>
+      </w:pPr>
+    </w:lvl>
+    <w:lvl w:ilvl="4" w:tplc="240A0019" w:tentative="1">
+      <w:start w:val="1"/>
+      <w:numFmt w:val="lowerLetter"/>
+      <w:lvlText w:val="%5."/>
+      <w:lvlJc w:val="left"/>
+      <w:pPr>
+        <w:ind w:left="3600" w:hanging="360"/>
+      </w:pPr>
+    </w:lvl>
+    <w:lvl w:ilvl="5" w:tplc="240A001B" w:tentative="1">
+      <w:start w:val="1"/>
+      <w:numFmt w:val="lowerRoman"/>
+      <w:lvlText w:val="%6."/>
+      <w:lvlJc w:val="right"/>
+      <w:pPr>
+        <w:ind w:left="4320" w:hanging="180"/>
+      </w:pPr>
+    </w:lvl>
+    <w:lvl w:ilvl="6" w:tplc="240A000F" w:tentative="1">
+      <w:start w:val="1"/>
+      <w:numFmt w:val="decimal"/>
+      <w:lvlText w:val="%7."/>
+      <w:lvlJc w:val="left"/>
+      <w:pPr>
+        <w:ind w:left="5040" w:hanging="360"/>
+      </w:pPr>
+    </w:lvl>
+    <w:lvl w:ilvl="7" w:tplc="240A0019" w:tentative="1">
+      <w:start w:val="1"/>
+      <w:numFmt w:val="lowerLetter"/>
+      <w:lvlText w:val="%8."/>
+      <w:lvlJc w:val="left"/>
+      <w:pPr>
+        <w:ind w:left="5760" w:hanging="360"/>
+      </w:pPr>
+    </w:lvl>
+    <w:lvl w:ilvl="8" w:tplc="240A001B" w:tentative="1">
+      <w:start w:val="1"/>
+      <w:numFmt w:val="lowerRoman"/>
+      <w:lvlText w:val="%9."/>
+      <w:lvlJc w:val="right"/>
+      <w:pPr>
+        <w:ind w:left="6480" w:hanging="180"/>
+      </w:pPr>
+    </w:lvl>
+  </w:abstractNum>
+  <w:abstractNum w:abstractNumId="2" w15:restartNumberingAfterBreak="0">
+    <w:nsid w:val="193E079A"/>
+    <w:multiLevelType w:val="hybridMultilevel"/>
+    <w:tmpl w:val="AFDADAA6"/>
+    <w:lvl w:ilvl="0" w:tplc="240A0001">
+      <w:start w:val="1"/>
+      <w:numFmt w:val="bullet"/>
+      <w:lvlText w:val=""/>
+      <w:lvlJc w:val="left"/>
+      <w:pPr>
+        <w:ind w:left="720" w:hanging="360"/>
+      </w:pPr>
+      <w:rPr>
+        <w:rFonts w:ascii="Symbol" w:hAnsi="Symbol" w:hint="default"/>
+      </w:rPr>
+    </w:lvl>
+    <w:lvl w:ilvl="1" w:tplc="240A0003" w:tentative="1">
+      <w:start w:val="1"/>
+      <w:numFmt w:val="bullet"/>
+      <w:lvlText w:val="o"/>
+      <w:lvlJc w:val="left"/>
+      <w:pPr>
+        <w:ind w:left="1440" w:hanging="360"/>
+      </w:pPr>
+      <w:rPr>
+        <w:rFonts w:ascii="Courier New" w:hAnsi="Courier New" w:cs="Courier New" w:hint="default"/>
+      </w:rPr>
+    </w:lvl>
+    <w:lvl w:ilvl="2" w:tplc="240A0005" w:tentative="1">
+      <w:start w:val="1"/>
+      <w:numFmt w:val="bullet"/>
+      <w:lvlText w:val=""/>
+      <w:lvlJc w:val="left"/>
+      <w:pPr>
+        <w:ind w:left="2160" w:hanging="360"/>
+      </w:pPr>
+      <w:rPr>
+        <w:rFonts w:ascii="Wingdings" w:hAnsi="Wingdings" w:hint="default"/>
+      </w:rPr>
+    </w:lvl>
+    <w:lvl w:ilvl="3" w:tplc="240A0001" w:tentative="1">
+      <w:start w:val="1"/>
+      <w:numFmt w:val="bullet"/>
+      <w:lvlText w:val=""/>
+      <w:lvlJc w:val="left"/>
+      <w:pPr>
+        <w:ind w:left="2880" w:hanging="360"/>
+      </w:pPr>
+      <w:rPr>
+        <w:rFonts w:ascii="Symbol" w:hAnsi="Symbol" w:hint="default"/>
+      </w:rPr>
+    </w:lvl>
+    <w:lvl w:ilvl="4" w:tplc="240A0003" w:tentative="1">
+      <w:start w:val="1"/>
+      <w:numFmt w:val="bullet"/>
+      <w:lvlText w:val="o"/>
+      <w:lvlJc w:val="left"/>
+      <w:pPr>
+        <w:ind w:left="3600" w:hanging="360"/>
+      </w:pPr>
+      <w:rPr>
+        <w:rFonts w:ascii="Courier New" w:hAnsi="Courier New" w:cs="Courier New" w:hint="default"/>
+      </w:rPr>
+    </w:lvl>
+    <w:lvl w:ilvl="5" w:tplc="240A0005" w:tentative="1">
+      <w:start w:val="1"/>
+      <w:numFmt w:val="bullet"/>
+      <w:lvlText w:val=""/>
+      <w:lvlJc w:val="left"/>
+      <w:pPr>
+        <w:ind w:left="4320" w:hanging="360"/>
+      </w:pPr>
+      <w:rPr>
+        <w:rFonts w:ascii="Wingdings" w:hAnsi="Wingdings" w:hint="default"/>
+      </w:rPr>
+    </w:lvl>
+    <w:lvl w:ilvl="6" w:tplc="240A0001" w:tentative="1">
+      <w:start w:val="1"/>
+      <w:numFmt w:val="bullet"/>
+      <w:lvlText w:val=""/>
+      <w:lvlJc w:val="left"/>
+      <w:pPr>
+        <w:ind w:left="5040" w:hanging="360"/>
+      </w:pPr>
+      <w:rPr>
+        <w:rFonts w:ascii="Symbol" w:hAnsi="Symbol" w:hint="default"/>
+      </w:rPr>
+    </w:lvl>
+    <w:lvl w:ilvl="7" w:tplc="240A0003" w:tentative="1">
+      <w:start w:val="1"/>
+      <w:numFmt w:val="bullet"/>
+      <w:lvlText w:val="o"/>
+      <w:lvlJc w:val="left"/>
+      <w:pPr>
+        <w:ind w:left="5760" w:hanging="360"/>
+      </w:pPr>
+      <w:rPr>
+        <w:rFonts w:ascii="Courier New" w:hAnsi="Courier New" w:cs="Courier New" w:hint="default"/>
+      </w:rPr>
+    </w:lvl>
+    <w:lvl w:ilvl="8" w:tplc="240A0005" w:tentative="1">
+      <w:start w:val="1"/>
+      <w:numFmt w:val="bullet"/>
+      <w:lvlText w:val=""/>
+      <w:lvlJc w:val="left"/>
+      <w:pPr>
+        <w:ind w:left="6480" w:hanging="360"/>
+      </w:pPr>
+      <w:rPr>
+        <w:rFonts w:ascii="Wingdings" w:hAnsi="Wingdings" w:hint="default"/>
+      </w:rPr>
+    </w:lvl>
+  </w:abstractNum>
+  <w:abstractNum w:abstractNumId="3" w15:restartNumberingAfterBreak="0">
+    <w:nsid w:val="55A30A9B"/>
+    <w:multiLevelType w:val="hybridMultilevel"/>
+    <w:tmpl w:val="FAA8CCEE"/>
+    <w:lvl w:ilvl="0" w:tplc="240A0001">
+      <w:start w:val="1"/>
+      <w:numFmt w:val="bullet"/>
+      <w:lvlText w:val=""/>
+      <w:lvlJc w:val="left"/>
+      <w:pPr>
+        <w:ind w:left="720" w:hanging="360"/>
+      </w:pPr>
+      <w:rPr>
+        <w:rFonts w:ascii="Symbol" w:hAnsi="Symbol" w:hint="default"/>
+      </w:rPr>
+    </w:lvl>
+    <w:lvl w:ilvl="1" w:tplc="FFFFFFFF" w:tentative="1">
+      <w:start w:val="1"/>
+      <w:numFmt w:val="lowerLetter"/>
+      <w:lvlText w:val="%2."/>
+      <w:lvlJc w:val="left"/>
+      <w:pPr>
+        <w:ind w:left="1440" w:hanging="360"/>
+      </w:pPr>
+    </w:lvl>
+    <w:lvl w:ilvl="2" w:tplc="FFFFFFFF" w:tentative="1">
+      <w:start w:val="1"/>
+      <w:numFmt w:val="lowerRoman"/>
+      <w:lvlText w:val="%3."/>
+      <w:lvlJc w:val="right"/>
+      <w:pPr>
+        <w:ind w:left="2160" w:hanging="180"/>
+      </w:pPr>
+    </w:lvl>
+    <w:lvl w:ilvl="3" w:tplc="FFFFFFFF" w:tentative="1">
+      <w:start w:val="1"/>
+      <w:numFmt w:val="decimal"/>
+      <w:lvlText w:val="%4."/>
+      <w:lvlJc w:val="left"/>
+      <w:pPr>
+        <w:ind w:left="2880" w:hanging="360"/>
+      </w:pPr>
+    </w:lvl>
+    <w:lvl w:ilvl="4" w:tplc="FFFFFFFF" w:tentative="1">
+      <w:start w:val="1"/>
+      <w:numFmt w:val="lowerLetter"/>
+      <w:lvlText w:val="%5."/>
+      <w:lvlJc w:val="left"/>
+      <w:pPr>
+        <w:ind w:left="3600" w:hanging="360"/>
+      </w:pPr>
+    </w:lvl>
+    <w:lvl w:ilvl="5" w:tplc="FFFFFFFF" w:tentative="1">
+      <w:start w:val="1"/>
+      <w:numFmt w:val="lowerRoman"/>
+      <w:lvlText w:val="%6."/>
+      <w:lvlJc w:val="right"/>
+      <w:pPr>
+        <w:ind w:left="4320" w:hanging="180"/>
+      </w:pPr>
+    </w:lvl>
+    <w:lvl w:ilvl="6" w:tplc="FFFFFFFF" w:tentative="1">
+      <w:start w:val="1"/>
+      <w:numFmt w:val="decimal"/>
+      <w:lvlText w:val="%7."/>
+      <w:lvlJc w:val="left"/>
+      <w:pPr>
+        <w:ind w:left="5040" w:hanging="360"/>
+      </w:pPr>
+    </w:lvl>
+    <w:lvl w:ilvl="7" w:tplc="FFFFFFFF" w:tentative="1">
+      <w:start w:val="1"/>
+      <w:numFmt w:val="lowerLetter"/>
+      <w:lvlText w:val="%8."/>
+      <w:lvlJc w:val="left"/>
+      <w:pPr>
+        <w:ind w:left="5760" w:hanging="360"/>
+      </w:pPr>
+    </w:lvl>
+    <w:lvl w:ilvl="8" w:tplc="FFFFFFFF" w:tentative="1">
+      <w:start w:val="1"/>
+      <w:numFmt w:val="lowerRoman"/>
+      <w:lvlText w:val="%9."/>
+      <w:lvlJc w:val="right"/>
+      <w:pPr>
+        <w:ind w:left="6480" w:hanging="180"/>
+      </w:pPr>
+    </w:lvl>
+  </w:abstractNum>
+  <w:abstractNum w:abstractNumId="4" w15:restartNumberingAfterBreak="0">
+    <w:nsid w:val="6AD66ABB"/>
+    <w:multiLevelType w:val="hybridMultilevel"/>
+    <w:tmpl w:val="049405E6"/>
+    <w:lvl w:ilvl="0" w:tplc="240A0001">
+      <w:start w:val="1"/>
+      <w:numFmt w:val="bullet"/>
+      <w:lvlText w:val=""/>
+      <w:lvlJc w:val="left"/>
+      <w:pPr>
+        <w:ind w:left="720" w:hanging="360"/>
+      </w:pPr>
+      <w:rPr>
+        <w:rFonts w:ascii="Symbol" w:hAnsi="Symbol" w:hint="default"/>
+      </w:rPr>
+    </w:lvl>
+    <w:lvl w:ilvl="1" w:tplc="240A0003" w:tentative="1">
+      <w:start w:val="1"/>
+      <w:numFmt w:val="bullet"/>
+      <w:lvlText w:val="o"/>
+      <w:lvlJc w:val="left"/>
+      <w:pPr>
+        <w:ind w:left="1440" w:hanging="360"/>
+      </w:pPr>
+      <w:rPr>
+        <w:rFonts w:ascii="Courier New" w:hAnsi="Courier New" w:cs="Courier New" w:hint="default"/>
+      </w:rPr>
+    </w:lvl>
+    <w:lvl w:ilvl="2" w:tplc="240A0005" w:tentative="1">
+      <w:start w:val="1"/>
+      <w:numFmt w:val="bullet"/>
+      <w:lvlText w:val=""/>
+      <w:lvlJc w:val="left"/>
+      <w:pPr>
+        <w:ind w:left="2160" w:hanging="360"/>
+      </w:pPr>
+      <w:rPr>
+        <w:rFonts w:ascii="Wingdings" w:hAnsi="Wingdings" w:hint="default"/>
+      </w:rPr>
+    </w:lvl>
+    <w:lvl w:ilvl="3" w:tplc="240A0001" w:tentative="1">
+      <w:start w:val="1"/>
+      <w:numFmt w:val="bullet"/>
+      <w:lvlText w:val=""/>
+      <w:lvlJc w:val="left"/>
+      <w:pPr>
+        <w:ind w:left="2880" w:hanging="360"/>
+      </w:pPr>
+      <w:rPr>
+        <w:rFonts w:ascii="Symbol" w:hAnsi="Symbol" w:hint="default"/>
+      </w:rPr>
+    </w:lvl>
+    <w:lvl w:ilvl="4" w:tplc="240A0003" w:tentative="1">
+      <w:start w:val="1"/>
+      <w:numFmt w:val="bullet"/>
+      <w:lvlText w:val="o"/>
+      <w:lvlJc w:val="left"/>
+      <w:pPr>
+        <w:ind w:left="3600" w:hanging="360"/>
+      </w:pPr>
+      <w:rPr>
+        <w:rFonts w:ascii="Courier New" w:hAnsi="Courier New" w:cs="Courier New" w:hint="default"/>
+      </w:rPr>
+    </w:lvl>
+    <w:lvl w:ilvl="5" w:tplc="240A0005" w:tentative="1">
+      <w:start w:val="1"/>
+      <w:numFmt w:val="bullet"/>
+      <w:lvlText w:val=""/>
+      <w:lvlJc w:val="left"/>
+      <w:pPr>
+        <w:ind w:left="4320" w:hanging="360"/>
+      </w:pPr>
+      <w:rPr>
+        <w:rFonts w:ascii="Wingdings" w:hAnsi="Wingdings" w:hint="default"/>
+      </w:rPr>
+    </w:lvl>
+    <w:lvl w:ilvl="6" w:tplc="240A0001" w:tentative="1">
+      <w:start w:val="1"/>
+      <w:numFmt w:val="bullet"/>
+      <w:lvlText w:val=""/>
+      <w:lvlJc w:val="left"/>
+      <w:pPr>
+        <w:ind w:left="5040" w:hanging="360"/>
+      </w:pPr>
+      <w:rPr>
+        <w:rFonts w:ascii="Symbol" w:hAnsi="Symbol" w:hint="default"/>
+      </w:rPr>
+    </w:lvl>
+    <w:lvl w:ilvl="7" w:tplc="240A0003" w:tentative="1">
+      <w:start w:val="1"/>
+      <w:numFmt w:val="bullet"/>
+      <w:lvlText w:val="o"/>
+      <w:lvlJc w:val="left"/>
+      <w:pPr>
+        <w:ind w:left="5760" w:hanging="360"/>
+      </w:pPr>
+      <w:rPr>
+        <w:rFonts w:ascii="Courier New" w:hAnsi="Courier New" w:cs="Courier New" w:hint="default"/>
+      </w:rPr>
+    </w:lvl>
+    <w:lvl w:ilvl="8" w:tplc="240A0005" w:tentative="1">
+      <w:start w:val="1"/>
+      <w:numFmt w:val="bullet"/>
+      <w:lvlText w:val=""/>
+      <w:lvlJc w:val="left"/>
+      <w:pPr>
+        <w:ind w:left="6480" w:hanging="360"/>
+      </w:pPr>
+      <w:rPr>
+        <w:rFonts w:ascii="Wingdings" w:hAnsi="Wingdings" w:hint="default"/>
+      </w:rPr>
+    </w:lvl>
+  </w:abstractNum>
+  <w:abstractNum w:abstractNumId="5" w15:restartNumberingAfterBreak="0">
+    <w:nsid w:val="70AF47B1"/>
+    <w:multiLevelType w:val="hybridMultilevel"/>
+    <w:tmpl w:val="64E29FE8"/>
+    <w:lvl w:ilvl="0" w:tplc="240A0001">
+      <w:start w:val="1"/>
+      <w:numFmt w:val="bullet"/>
+      <w:lvlText w:val=""/>
+      <w:lvlJc w:val="left"/>
+      <w:pPr>
+        <w:ind w:left="720" w:hanging="360"/>
+      </w:pPr>
+      <w:rPr>
+        <w:rFonts w:ascii="Symbol" w:hAnsi="Symbol" w:hint="default"/>
+      </w:rPr>
+    </w:lvl>
+    <w:lvl w:ilvl="1" w:tplc="240A0003" w:tentative="1">
+      <w:start w:val="1"/>
+      <w:numFmt w:val="bullet"/>
+      <w:lvlText w:val="o"/>
+      <w:lvlJc w:val="left"/>
+      <w:pPr>
+        <w:ind w:left="1440" w:hanging="360"/>
+      </w:pPr>
+      <w:rPr>
+        <w:rFonts w:ascii="Courier New" w:hAnsi="Courier New" w:cs="Courier New" w:hint="default"/>
+      </w:rPr>
+    </w:lvl>
+    <w:lvl w:ilvl="2" w:tplc="240A0005" w:tentative="1">
+      <w:start w:val="1"/>
+      <w:numFmt w:val="bullet"/>
+      <w:lvlText w:val=""/>
+      <w:lvlJc w:val="left"/>
+      <w:pPr>
+        <w:ind w:left="2160" w:hanging="360"/>
+      </w:pPr>
+      <w:rPr>
+        <w:rFonts w:ascii="Wingdings" w:hAnsi="Wingdings" w:hint="default"/>
+      </w:rPr>
+    </w:lvl>
+    <w:lvl w:ilvl="3" w:tplc="240A0001" w:tentative="1">
+      <w:start w:val="1"/>
+      <w:numFmt w:val="bullet"/>
+      <w:lvlText w:val=""/>
+      <w:lvlJc w:val="left"/>
+      <w:pPr>
+        <w:ind w:left="2880" w:hanging="360"/>
+      </w:pPr>
+      <w:rPr>
+        <w:rFonts w:ascii="Symbol" w:hAnsi="Symbol" w:hint="default"/>
+      </w:rPr>
+    </w:lvl>
+    <w:lvl w:ilvl="4" w:tplc="240A0003" w:tentative="1">
+      <w:start w:val="1"/>
+      <w:numFmt w:val="bullet"/>
+      <w:lvlText w:val="o"/>
+      <w:lvlJc w:val="left"/>
+      <w:pPr>
+        <w:ind w:left="3600" w:hanging="360"/>
+      </w:pPr>
+      <w:rPr>
+        <w:rFonts w:ascii="Courier New" w:hAnsi="Courier New" w:cs="Courier New" w:hint="default"/>
+      </w:rPr>
+    </w:lvl>
+    <w:lvl w:ilvl="5" w:tplc="240A0005" w:tentative="1">
+      <w:start w:val="1"/>
+      <w:numFmt w:val="bullet"/>
+      <w:lvlText w:val=""/>
+      <w:lvlJc w:val="left"/>
+      <w:pPr>
+        <w:ind w:left="4320" w:hanging="360"/>
+      </w:pPr>
+      <w:rPr>
+        <w:rFonts w:ascii="Wingdings" w:hAnsi="Wingdings" w:hint="default"/>
+      </w:rPr>
+    </w:lvl>
+    <w:lvl w:ilvl="6" w:tplc="240A0001" w:tentative="1">
+      <w:start w:val="1"/>
+      <w:numFmt w:val="bullet"/>
+      <w:lvlText w:val=""/>
+      <w:lvlJc w:val="left"/>
+      <w:pPr>
+        <w:ind w:left="5040" w:hanging="360"/>
+      </w:pPr>
+      <w:rPr>
+        <w:rFonts w:ascii="Symbol" w:hAnsi="Symbol" w:hint="default"/>
+      </w:rPr>
+    </w:lvl>
+    <w:lvl w:ilvl="7" w:tplc="240A0003" w:tentative="1">
+      <w:start w:val="1"/>
+      <w:numFmt w:val="bullet"/>
+      <w:lvlText w:val="o"/>
+      <w:lvlJc w:val="left"/>
+      <w:pPr>
+        <w:ind w:left="5760" w:hanging="360"/>
+      </w:pPr>
+      <w:rPr>
+        <w:rFonts w:ascii="Courier New" w:hAnsi="Courier New" w:cs="Courier New" w:hint="default"/>
+      </w:rPr>
+    </w:lvl>
+    <w:lvl w:ilvl="8" w:tplc="240A0005" w:tentative="1">
+      <w:start w:val="1"/>
+      <w:numFmt w:val="bullet"/>
+      <w:lvlText w:val=""/>
+      <w:lvlJc w:val="left"/>
+      <w:pPr>
+        <w:ind w:left="6480" w:hanging="360"/>
+      </w:pPr>
+      <w:rPr>
+        <w:rFonts w:ascii="Wingdings" w:hAnsi="Wingdings" w:hint="default"/>
+      </w:rPr>
+    </w:lvl>
+  </w:abstractNum>
+  <w:num w:numId="1" w16cid:durableId="845217867">
+    <w:abstractNumId w:val="4"/>
+  </w:num>
+  <w:num w:numId="2" w16cid:durableId="1713383385">
+    <w:abstractNumId w:val="5"/>
+  </w:num>
+  <w:num w:numId="3" w16cid:durableId="1481507252">
+    <w:abstractNumId w:val="1"/>
+  </w:num>
+  <w:num w:numId="4" w16cid:durableId="2083211682">
+    <w:abstractNumId w:val="3"/>
+  </w:num>
+  <w:num w:numId="5" w16cid:durableId="451094110">
+    <w:abstractNumId w:val="0"/>
+  </w:num>
+  <w:num w:numId="6" w16cid:durableId="583995810">
+    <w:abstractNumId w:val="2"/>
+  </w:num>
+</w:numbering>
 </file>
 
 <file path=word/styles.xml><?xml version="1.0" encoding="utf-8"?>
@@ -1042,6 +2128,27 @@
         <w:insideV w:val="single" w:sz="4" w:space="0" w:color="BFBFBF" w:themeColor="background1" w:themeShade="BF"/>
       </w:tblBorders>
     </w:tblPr>
+  </w:style>
+  <w:style w:type="paragraph" w:styleId="Prrafodelista">
+    <w:name w:val="List Paragraph"/>
+    <w:basedOn w:val="Normal"/>
+    <w:uiPriority w:val="34"/>
+    <w:qFormat/>
+    <w:rsid w:val="00761F68"/>
+    <w:pPr>
+      <w:ind w:left="720"/>
+      <w:contextualSpacing/>
+    </w:pPr>
+  </w:style>
+  <w:style w:type="character" w:styleId="Textodelmarcadordeposicin">
+    <w:name w:val="Placeholder Text"/>
+    <w:basedOn w:val="Fuentedeprrafopredeter"/>
+    <w:uiPriority w:val="99"/>
+    <w:semiHidden/>
+    <w:rsid w:val="00761F68"/>
+    <w:rPr>
+      <w:color w:val="666666"/>
+    </w:rPr>
   </w:style>
 </w:styles>
 </file>

</xml_diff>